<commit_message>
Add basic Linux commands notes and assigntment file
</commit_message>
<xml_diff>
--- a/Students  Attendance System.docx
+++ b/Students  Attendance System.docx
@@ -4,6 +4,39 @@
   <w:body>
     <w:p>
       <w:pPr>
+        <w:pStyle w:val="Heading1"/>
+        <w:rPr>
+          <w:u w:val="single"/>
+        </w:rPr>
+      </w:pPr>
+    </w:p>
+    <w:p>
+      <w:pPr>
+        <w:pStyle w:val="Heading1"/>
+        <w:ind w:left="720"/>
+      </w:pPr>
+      <w:r>
+        <w:t>Basic Linux/Ubuntu Commands</w:t>
+      </w:r>
+    </w:p>
+    <w:p>
+      <w:pPr>
+        <w:rPr>
+          <w:rFonts w:asciiTheme="majorHAnsi" w:eastAsiaTheme="majorEastAsia" w:hAnsiTheme="majorHAnsi" w:cstheme="majorBidi"/>
+          <w:color w:val="2F5496" w:themeColor="accent1" w:themeShade="BF"/>
+          <w:sz w:val="40"/>
+          <w:szCs w:val="40"/>
+        </w:rPr>
+      </w:pPr>
+    </w:p>
+    <w:p>
+      <w:pPr>
+        <w:pStyle w:val="ListParagraph"/>
+        <w:numPr>
+          <w:ilvl w:val="0"/>
+          <w:numId w:val="2"/>
+        </w:numPr>
+        <w:jc w:val="both"/>
         <w:rPr>
           <w:b/>
           <w:bCs/>
@@ -14,82 +47,12 @@
           <w:b/>
           <w:bCs/>
         </w:rPr>
-        <w:t>Student Attendance System-System Requirements</w:t>
+        <w:t>Is – List files</w:t>
       </w:r>
     </w:p>
     <w:p>
       <w:r>
-        <w:t>Functional Requirements</w:t>
-      </w:r>
-    </w:p>
-    <w:p>
-      <w:pPr>
-        <w:pStyle w:val="ListParagraph"/>
-        <w:numPr>
-          <w:ilvl w:val="0"/>
-          <w:numId w:val="1"/>
-        </w:numPr>
-      </w:pPr>
-      <w:r>
-        <w:t>Student registration</w:t>
-      </w:r>
-    </w:p>
-    <w:p>
-      <w:pPr>
-        <w:pStyle w:val="ListParagraph"/>
-        <w:numPr>
-          <w:ilvl w:val="0"/>
-          <w:numId w:val="1"/>
-        </w:numPr>
-      </w:pPr>
-      <w:r>
-        <w:t>Student attendance recording</w:t>
-      </w:r>
-    </w:p>
-    <w:p>
-      <w:pPr>
-        <w:pStyle w:val="ListParagraph"/>
-        <w:numPr>
-          <w:ilvl w:val="0"/>
-          <w:numId w:val="1"/>
-        </w:numPr>
-      </w:pPr>
-      <w:r>
-        <w:t>View attendance records</w:t>
-      </w:r>
-    </w:p>
-    <w:p>
-      <w:pPr>
-        <w:pStyle w:val="ListParagraph"/>
-        <w:numPr>
-          <w:ilvl w:val="0"/>
-          <w:numId w:val="1"/>
-        </w:numPr>
-      </w:pPr>
-      <w:r>
-        <w:t>Generate attendance reports</w:t>
-      </w:r>
-    </w:p>
-    <w:p>
-      <w:pPr>
-        <w:pStyle w:val="ListParagraph"/>
-        <w:numPr>
-          <w:ilvl w:val="0"/>
-          <w:numId w:val="1"/>
-        </w:numPr>
-      </w:pPr>
-      <w:proofErr w:type="gramStart"/>
-      <w:r>
-        <w:t>Manage  student</w:t>
-      </w:r>
-      <w:proofErr w:type="gramEnd"/>
-      <w:r>
-        <w:t xml:space="preserve"> information</w:t>
-      </w:r>
-    </w:p>
-    <w:p>
-      <w:r>
-        <w:t>Non-Functional Requirements</w:t>
+        <w:t xml:space="preserve">           Used to display files and directories in the current location.</w:t>
       </w:r>
     </w:p>
     <w:p>
@@ -99,9 +62,23 @@
           <w:ilvl w:val="0"/>
           <w:numId w:val="2"/>
         </w:numPr>
+        <w:jc w:val="both"/>
+        <w:rPr>
+          <w:b/>
+          <w:bCs/>
+        </w:rPr>
       </w:pPr>
       <w:r>
-        <w:t>Easy to use</w:t>
+        <w:rPr>
+          <w:b/>
+          <w:bCs/>
+        </w:rPr>
+        <w:t>Mkdir – Create a  directory</w:t>
+      </w:r>
+    </w:p>
+    <w:p>
+      <w:r>
+        <w:t xml:space="preserve">           Used to create a new directory (folder).</w:t>
       </w:r>
     </w:p>
     <w:p>
@@ -111,9 +88,26 @@
           <w:ilvl w:val="0"/>
           <w:numId w:val="2"/>
         </w:numPr>
+        <w:rPr>
+          <w:b/>
+          <w:bCs/>
+        </w:rPr>
       </w:pPr>
       <w:r>
-        <w:t>Secure</w:t>
+        <w:rPr>
+          <w:b/>
+          <w:bCs/>
+        </w:rPr>
+        <w:t>Cd – Change directory</w:t>
+      </w:r>
+    </w:p>
+    <w:p>
+      <w:pPr>
+        <w:ind w:left="720"/>
+        <w:jc w:val="both"/>
+      </w:pPr>
+      <w:r>
+        <w:t>Used to move from one  directory to another.</w:t>
       </w:r>
     </w:p>
     <w:p>
@@ -123,13 +117,6 @@
           <w:ilvl w:val="0"/>
           <w:numId w:val="2"/>
         </w:numPr>
-      </w:pPr>
-      <w:r>
-        <w:t xml:space="preserve">Fast and reliable </w:t>
-      </w:r>
-    </w:p>
-    <w:p>
-      <w:pPr>
         <w:rPr>
           <w:b/>
           <w:bCs/>
@@ -140,107 +127,92 @@
           <w:b/>
           <w:bCs/>
         </w:rPr>
-        <w:t>Hardware Requirements</w:t>
+        <w:t xml:space="preserve">Pwd – Present working  </w:t>
       </w:r>
-    </w:p>
-    <w:p>
-      <w:pPr>
-        <w:pStyle w:val="ListParagraph"/>
-        <w:numPr>
-          <w:ilvl w:val="0"/>
-          <w:numId w:val="3"/>
-        </w:numPr>
-      </w:pPr>
-      <w:r>
-        <w:t>Computer</w:t>
-      </w:r>
-    </w:p>
-    <w:p>
-      <w:pPr>
-        <w:pStyle w:val="ListParagraph"/>
-        <w:numPr>
-          <w:ilvl w:val="0"/>
-          <w:numId w:val="3"/>
-        </w:numPr>
-      </w:pPr>
-      <w:r>
-        <w:t>Keyboard and mouse</w:t>
-      </w:r>
-    </w:p>
-    <w:p>
-      <w:pPr>
-        <w:pStyle w:val="ListParagraph"/>
-        <w:numPr>
-          <w:ilvl w:val="0"/>
-          <w:numId w:val="3"/>
-        </w:numPr>
-      </w:pPr>
-      <w:r>
-        <w:t>Internet connection</w:t>
-      </w:r>
-    </w:p>
-    <w:p/>
-    <w:p>
-      <w:pPr>
-        <w:rPr>
-          <w:b/>
-          <w:bCs/>
-        </w:rPr>
-      </w:pPr>
       <w:r>
         <w:rPr>
           <w:b/>
           <w:bCs/>
         </w:rPr>
-        <w:t>Software Requirements</w:t>
+        <w:t>D</w:t>
+      </w:r>
+      <w:r>
+        <w:rPr>
+          <w:b/>
+          <w:bCs/>
+        </w:rPr>
+        <w:t>irectory</w:t>
       </w:r>
     </w:p>
     <w:p>
       <w:pPr>
+        <w:ind w:firstLine="720"/>
+      </w:pPr>
+      <w:r>
+        <w:t>Used to show the directory you are currently in.</w:t>
+      </w:r>
+    </w:p>
+    <w:p>
+      <w:pPr>
         <w:pStyle w:val="ListParagraph"/>
         <w:numPr>
           <w:ilvl w:val="0"/>
-          <w:numId w:val="4"/>
+          <w:numId w:val="2"/>
         </w:numPr>
+        <w:rPr>
+          <w:b/>
+          <w:bCs/>
+        </w:rPr>
       </w:pPr>
       <w:r>
-        <w:t>Windows/Linux</w:t>
+        <w:lastRenderedPageBreak/>
+        <w:t xml:space="preserve">touch  </w:t>
+      </w:r>
+      <w:r>
+        <w:rPr>
+          <w:b/>
+          <w:bCs/>
+        </w:rPr>
+        <w:t>- Create a file</w:t>
       </w:r>
     </w:p>
     <w:p>
       <w:pPr>
+        <w:ind w:firstLine="720"/>
+      </w:pPr>
+      <w:r>
+        <w:t>Used to create a new empty file.</w:t>
+      </w:r>
+    </w:p>
+    <w:p>
+      <w:pPr>
         <w:pStyle w:val="ListParagraph"/>
         <w:numPr>
           <w:ilvl w:val="0"/>
-          <w:numId w:val="4"/>
+          <w:numId w:val="2"/>
         </w:numPr>
+        <w:rPr>
+          <w:b/>
+          <w:bCs/>
+        </w:rPr>
       </w:pPr>
       <w:r>
-        <w:t>Web browser</w:t>
+        <w:t xml:space="preserve">nano </w:t>
+      </w:r>
+      <w:r>
+        <w:rPr>
+          <w:b/>
+          <w:bCs/>
+        </w:rPr>
+        <w:t>– Edit a file</w:t>
       </w:r>
     </w:p>
     <w:p>
       <w:pPr>
-        <w:pStyle w:val="ListParagraph"/>
-        <w:numPr>
-          <w:ilvl w:val="0"/>
-          <w:numId w:val="4"/>
-        </w:numPr>
+        <w:ind w:firstLine="720"/>
       </w:pPr>
       <w:r>
-        <w:t>Database</w:t>
-      </w:r>
-    </w:p>
-    <w:p>
-      <w:pPr>
-        <w:pStyle w:val="ListParagraph"/>
-        <w:numPr>
-          <w:ilvl w:val="0"/>
-          <w:numId w:val="4"/>
-        </w:numPr>
-      </w:pPr>
-      <w:r>
-        <w:t>Code editor</w:t>
+        <w:t>Used to create or edit a text file from the Terminal.</w:t>
       </w:r>
     </w:p>
     <w:sectPr>
@@ -256,16 +228,16 @@
 <file path=word/numbering.xml><?xml version="1.0" encoding="utf-8"?>
 <w:numbering xmlns:wpc="http://schemas.microsoft.com/office/word/2010/wordprocessingCanvas" xmlns:cx="http://schemas.microsoft.com/office/drawing/2014/chartex" xmlns:cx1="http://schemas.microsoft.com/office/drawing/2015/9/8/chartex" xmlns:cx2="http://schemas.microsoft.com/office/drawing/2015/10/21/chartex" xmlns:cx3="http://schemas.microsoft.com/office/drawing/2016/5/9/chartex" xmlns:cx4="http://schemas.microsoft.com/office/drawing/2016/5/10/chartex" xmlns:cx5="http://schemas.microsoft.com/office/drawing/2016/5/11/chartex" xmlns:cx6="http://schemas.microsoft.com/office/drawing/2016/5/12/chartex" xmlns:cx7="http://schemas.microsoft.com/office/drawing/2016/5/13/chartex" xmlns:cx8="http://schemas.microsoft.com/office/drawing/2016/5/14/chartex" xmlns:mc="http://schemas.openxmlformats.org/markup-compatibility/2006" xmlns:aink="http://schemas.microsoft.com/office/drawing/2016/ink" xmlns:am3d="http://schemas.microsoft.com/office/drawing/2017/model3d" xmlns:o="urn:schemas-microsoft-com:office:office" xmlns:oel="http://schemas.microsoft.com/office/2019/extlst" xmlns:r="http://schemas.openxmlformats.org/officeDocument/2006/relationships" xmlns:m="http://schemas.openxmlformats.org/officeDocument/2006/math" xmlns:v="urn:schemas-microsoft-com:vml" xmlns:wp14="http://schemas.microsoft.com/office/word/2010/wordprocessingDrawing" xmlns:wp="http://schemas.openxmlformats.org/drawingml/2006/wordprocessingDrawing" xmlns:w10="urn:schemas-microsoft-com:office:word" xmlns:w="http://schemas.openxmlformats.org/wordprocessingml/2006/main" xmlns:w14="http://schemas.microsoft.com/office/word/2010/wordml" xmlns:w15="http://schemas.microsoft.com/office/word/2012/wordml" xmlns:w16cex="http://schemas.microsoft.com/office/word/2018/wordml/cex" xmlns:w16cid="http://schemas.microsoft.com/office/word/2016/wordml/cid" xmlns:w16="http://schemas.microsoft.com/office/word/2018/wordml" xmlns:w16du="http://schemas.microsoft.com/office/word/2023/wordml/word16du" xmlns:w16sdtdh="http://schemas.microsoft.com/office/word/2020/wordml/sdtdatahash" xmlns:w16sdtfl="http://schemas.microsoft.com/office/word/2024/wordml/sdtformatlock" xmlns:w16se="http://schemas.microsoft.com/office/word/2015/wordml/symex" xmlns:wpg="http://schemas.microsoft.com/office/word/2010/wordprocessingGroup" xmlns:wpi="http://schemas.microsoft.com/office/word/2010/wordprocessingInk" xmlns:wne="http://schemas.microsoft.com/office/word/2006/wordml" xmlns:wps="http://schemas.microsoft.com/office/word/2010/wordprocessingShape" mc:Ignorable="w14 w15 w16se w16cid w16 w16cex w16sdtdh w16sdtfl w16du wp14">
   <w:abstractNum w:abstractNumId="0" w15:restartNumberingAfterBreak="0">
-    <w:nsid w:val="18AB10FF"/>
+    <w:nsid w:val="37DA6C41"/>
     <w:multiLevelType w:val="hybridMultilevel"/>
-    <w:tmpl w:val="624EB0CA"/>
+    <w:tmpl w:val="80BE7714"/>
     <w:lvl w:ilvl="0" w:tplc="04090001">
       <w:start w:val="1"/>
       <w:numFmt w:val="bullet"/>
       <w:lvlText w:val=""/>
       <w:lvlJc w:val="left"/>
       <w:pPr>
-        <w:ind w:left="720" w:hanging="360"/>
+        <w:ind w:left="1440" w:hanging="360"/>
       </w:pPr>
       <w:rPr>
         <w:rFonts w:ascii="Symbol" w:hAnsi="Symbol" w:hint="default"/>
@@ -277,7 +249,7 @@
       <w:lvlText w:val="o"/>
       <w:lvlJc w:val="left"/>
       <w:pPr>
-        <w:ind w:left="1440" w:hanging="360"/>
+        <w:ind w:left="2160" w:hanging="360"/>
       </w:pPr>
       <w:rPr>
         <w:rFonts w:ascii="Courier New" w:hAnsi="Courier New" w:cs="Courier New" w:hint="default"/>
@@ -289,7 +261,7 @@
       <w:lvlText w:val=""/>
       <w:lvlJc w:val="left"/>
       <w:pPr>
-        <w:ind w:left="2160" w:hanging="360"/>
+        <w:ind w:left="2880" w:hanging="360"/>
       </w:pPr>
       <w:rPr>
         <w:rFonts w:ascii="Wingdings" w:hAnsi="Wingdings" w:hint="default"/>
@@ -301,7 +273,7 @@
       <w:lvlText w:val=""/>
       <w:lvlJc w:val="left"/>
       <w:pPr>
-        <w:ind w:left="2880" w:hanging="360"/>
+        <w:ind w:left="3600" w:hanging="360"/>
       </w:pPr>
       <w:rPr>
         <w:rFonts w:ascii="Symbol" w:hAnsi="Symbol" w:hint="default"/>
@@ -313,7 +285,7 @@
       <w:lvlText w:val="o"/>
       <w:lvlJc w:val="left"/>
       <w:pPr>
-        <w:ind w:left="3600" w:hanging="360"/>
+        <w:ind w:left="4320" w:hanging="360"/>
       </w:pPr>
       <w:rPr>
         <w:rFonts w:ascii="Courier New" w:hAnsi="Courier New" w:cs="Courier New" w:hint="default"/>
@@ -325,7 +297,7 @@
       <w:lvlText w:val=""/>
       <w:lvlJc w:val="left"/>
       <w:pPr>
-        <w:ind w:left="4320" w:hanging="360"/>
+        <w:ind w:left="5040" w:hanging="360"/>
       </w:pPr>
       <w:rPr>
         <w:rFonts w:ascii="Wingdings" w:hAnsi="Wingdings" w:hint="default"/>
@@ -337,7 +309,7 @@
       <w:lvlText w:val=""/>
       <w:lvlJc w:val="left"/>
       <w:pPr>
-        <w:ind w:left="5040" w:hanging="360"/>
+        <w:ind w:left="5760" w:hanging="360"/>
       </w:pPr>
       <w:rPr>
         <w:rFonts w:ascii="Symbol" w:hAnsi="Symbol" w:hint="default"/>
@@ -349,7 +321,7 @@
       <w:lvlText w:val="o"/>
       <w:lvlJc w:val="left"/>
       <w:pPr>
-        <w:ind w:left="5760" w:hanging="360"/>
+        <w:ind w:left="6480" w:hanging="360"/>
       </w:pPr>
       <w:rPr>
         <w:rFonts w:ascii="Courier New" w:hAnsi="Courier New" w:cs="Courier New" w:hint="default"/>
@@ -361,7 +333,7 @@
       <w:lvlText w:val=""/>
       <w:lvlJc w:val="left"/>
       <w:pPr>
-        <w:ind w:left="6480" w:hanging="360"/>
+        <w:ind w:left="7200" w:hanging="360"/>
       </w:pPr>
       <w:rPr>
         <w:rFonts w:ascii="Wingdings" w:hAnsi="Wingdings" w:hint="default"/>
@@ -369,355 +341,185 @@
     </w:lvl>
   </w:abstractNum>
   <w:abstractNum w:abstractNumId="1" w15:restartNumberingAfterBreak="0">
-    <w:nsid w:val="4583642F"/>
+    <w:nsid w:val="5B4949F1"/>
     <w:multiLevelType w:val="hybridMultilevel"/>
-    <w:tmpl w:val="68C6EEE2"/>
-    <w:lvl w:ilvl="0" w:tplc="04090001">
-      <w:start w:val="1"/>
-      <w:numFmt w:val="bullet"/>
-      <w:lvlText w:val=""/>
+    <w:tmpl w:val="12DCE622"/>
+    <w:lvl w:ilvl="0" w:tplc="0409000F">
+      <w:start w:val="1"/>
+      <w:numFmt w:val="decimal"/>
+      <w:lvlText w:val="%1."/>
       <w:lvlJc w:val="left"/>
       <w:pPr>
         <w:ind w:left="720" w:hanging="360"/>
       </w:pPr>
-      <w:rPr>
-        <w:rFonts w:ascii="Symbol" w:hAnsi="Symbol" w:hint="default"/>
-      </w:rPr>
-    </w:lvl>
-    <w:lvl w:ilvl="1" w:tplc="04090003" w:tentative="1">
-      <w:start w:val="1"/>
-      <w:numFmt w:val="bullet"/>
-      <w:lvlText w:val="o"/>
+    </w:lvl>
+    <w:lvl w:ilvl="1" w:tplc="04090019" w:tentative="1">
+      <w:start w:val="1"/>
+      <w:numFmt w:val="lowerLetter"/>
+      <w:lvlText w:val="%2."/>
       <w:lvlJc w:val="left"/>
       <w:pPr>
         <w:ind w:left="1440" w:hanging="360"/>
       </w:pPr>
-      <w:rPr>
-        <w:rFonts w:ascii="Courier New" w:hAnsi="Courier New" w:cs="Courier New" w:hint="default"/>
-      </w:rPr>
-    </w:lvl>
-    <w:lvl w:ilvl="2" w:tplc="04090005" w:tentative="1">
-      <w:start w:val="1"/>
-      <w:numFmt w:val="bullet"/>
-      <w:lvlText w:val=""/>
-      <w:lvlJc w:val="left"/>
-      <w:pPr>
-        <w:ind w:left="2160" w:hanging="360"/>
-      </w:pPr>
-      <w:rPr>
-        <w:rFonts w:ascii="Wingdings" w:hAnsi="Wingdings" w:hint="default"/>
-      </w:rPr>
-    </w:lvl>
-    <w:lvl w:ilvl="3" w:tplc="04090001" w:tentative="1">
-      <w:start w:val="1"/>
-      <w:numFmt w:val="bullet"/>
-      <w:lvlText w:val=""/>
+    </w:lvl>
+    <w:lvl w:ilvl="2" w:tplc="0409001B" w:tentative="1">
+      <w:start w:val="1"/>
+      <w:numFmt w:val="lowerRoman"/>
+      <w:lvlText w:val="%3."/>
+      <w:lvlJc w:val="right"/>
+      <w:pPr>
+        <w:ind w:left="2160" w:hanging="180"/>
+      </w:pPr>
+    </w:lvl>
+    <w:lvl w:ilvl="3" w:tplc="0409000F" w:tentative="1">
+      <w:start w:val="1"/>
+      <w:numFmt w:val="decimal"/>
+      <w:lvlText w:val="%4."/>
       <w:lvlJc w:val="left"/>
       <w:pPr>
         <w:ind w:left="2880" w:hanging="360"/>
       </w:pPr>
-      <w:rPr>
-        <w:rFonts w:ascii="Symbol" w:hAnsi="Symbol" w:hint="default"/>
-      </w:rPr>
-    </w:lvl>
-    <w:lvl w:ilvl="4" w:tplc="04090003" w:tentative="1">
-      <w:start w:val="1"/>
-      <w:numFmt w:val="bullet"/>
-      <w:lvlText w:val="o"/>
+    </w:lvl>
+    <w:lvl w:ilvl="4" w:tplc="04090019" w:tentative="1">
+      <w:start w:val="1"/>
+      <w:numFmt w:val="lowerLetter"/>
+      <w:lvlText w:val="%5."/>
       <w:lvlJc w:val="left"/>
       <w:pPr>
         <w:ind w:left="3600" w:hanging="360"/>
       </w:pPr>
-      <w:rPr>
-        <w:rFonts w:ascii="Courier New" w:hAnsi="Courier New" w:cs="Courier New" w:hint="default"/>
-      </w:rPr>
-    </w:lvl>
-    <w:lvl w:ilvl="5" w:tplc="04090005" w:tentative="1">
-      <w:start w:val="1"/>
-      <w:numFmt w:val="bullet"/>
-      <w:lvlText w:val=""/>
-      <w:lvlJc w:val="left"/>
-      <w:pPr>
-        <w:ind w:left="4320" w:hanging="360"/>
-      </w:pPr>
-      <w:rPr>
-        <w:rFonts w:ascii="Wingdings" w:hAnsi="Wingdings" w:hint="default"/>
-      </w:rPr>
-    </w:lvl>
-    <w:lvl w:ilvl="6" w:tplc="04090001" w:tentative="1">
-      <w:start w:val="1"/>
-      <w:numFmt w:val="bullet"/>
-      <w:lvlText w:val=""/>
+    </w:lvl>
+    <w:lvl w:ilvl="5" w:tplc="0409001B" w:tentative="1">
+      <w:start w:val="1"/>
+      <w:numFmt w:val="lowerRoman"/>
+      <w:lvlText w:val="%6."/>
+      <w:lvlJc w:val="right"/>
+      <w:pPr>
+        <w:ind w:left="4320" w:hanging="180"/>
+      </w:pPr>
+    </w:lvl>
+    <w:lvl w:ilvl="6" w:tplc="0409000F" w:tentative="1">
+      <w:start w:val="1"/>
+      <w:numFmt w:val="decimal"/>
+      <w:lvlText w:val="%7."/>
       <w:lvlJc w:val="left"/>
       <w:pPr>
         <w:ind w:left="5040" w:hanging="360"/>
       </w:pPr>
-      <w:rPr>
-        <w:rFonts w:ascii="Symbol" w:hAnsi="Symbol" w:hint="default"/>
-      </w:rPr>
-    </w:lvl>
-    <w:lvl w:ilvl="7" w:tplc="04090003" w:tentative="1">
-      <w:start w:val="1"/>
-      <w:numFmt w:val="bullet"/>
-      <w:lvlText w:val="o"/>
+    </w:lvl>
+    <w:lvl w:ilvl="7" w:tplc="04090019" w:tentative="1">
+      <w:start w:val="1"/>
+      <w:numFmt w:val="lowerLetter"/>
+      <w:lvlText w:val="%8."/>
       <w:lvlJc w:val="left"/>
       <w:pPr>
         <w:ind w:left="5760" w:hanging="360"/>
       </w:pPr>
-      <w:rPr>
-        <w:rFonts w:ascii="Courier New" w:hAnsi="Courier New" w:cs="Courier New" w:hint="default"/>
-      </w:rPr>
-    </w:lvl>
-    <w:lvl w:ilvl="8" w:tplc="04090005" w:tentative="1">
-      <w:start w:val="1"/>
-      <w:numFmt w:val="bullet"/>
-      <w:lvlText w:val=""/>
-      <w:lvlJc w:val="left"/>
-      <w:pPr>
-        <w:ind w:left="6480" w:hanging="360"/>
-      </w:pPr>
-      <w:rPr>
-        <w:rFonts w:ascii="Wingdings" w:hAnsi="Wingdings" w:hint="default"/>
-      </w:rPr>
+    </w:lvl>
+    <w:lvl w:ilvl="8" w:tplc="0409001B" w:tentative="1">
+      <w:start w:val="1"/>
+      <w:numFmt w:val="lowerRoman"/>
+      <w:lvlText w:val="%9."/>
+      <w:lvlJc w:val="right"/>
+      <w:pPr>
+        <w:ind w:left="6480" w:hanging="180"/>
+      </w:pPr>
     </w:lvl>
   </w:abstractNum>
   <w:abstractNum w:abstractNumId="2" w15:restartNumberingAfterBreak="0">
-    <w:nsid w:val="51F72C58"/>
+    <w:nsid w:val="606852AB"/>
     <w:multiLevelType w:val="hybridMultilevel"/>
-    <w:tmpl w:val="C0DA105E"/>
-    <w:lvl w:ilvl="0" w:tplc="04090001">
-      <w:start w:val="1"/>
-      <w:numFmt w:val="bullet"/>
-      <w:lvlText w:val=""/>
+    <w:tmpl w:val="7D768F08"/>
+    <w:lvl w:ilvl="0" w:tplc="0409000F">
+      <w:start w:val="1"/>
+      <w:numFmt w:val="decimal"/>
+      <w:lvlText w:val="%1."/>
       <w:lvlJc w:val="left"/>
       <w:pPr>
         <w:ind w:left="720" w:hanging="360"/>
       </w:pPr>
-      <w:rPr>
-        <w:rFonts w:ascii="Symbol" w:hAnsi="Symbol" w:hint="default"/>
-      </w:rPr>
-    </w:lvl>
-    <w:lvl w:ilvl="1" w:tplc="04090003" w:tentative="1">
-      <w:start w:val="1"/>
-      <w:numFmt w:val="bullet"/>
-      <w:lvlText w:val="o"/>
+    </w:lvl>
+    <w:lvl w:ilvl="1" w:tplc="04090019" w:tentative="1">
+      <w:start w:val="1"/>
+      <w:numFmt w:val="lowerLetter"/>
+      <w:lvlText w:val="%2."/>
       <w:lvlJc w:val="left"/>
       <w:pPr>
         <w:ind w:left="1440" w:hanging="360"/>
       </w:pPr>
-      <w:rPr>
-        <w:rFonts w:ascii="Courier New" w:hAnsi="Courier New" w:cs="Courier New" w:hint="default"/>
-      </w:rPr>
-    </w:lvl>
-    <w:lvl w:ilvl="2" w:tplc="04090005" w:tentative="1">
-      <w:start w:val="1"/>
-      <w:numFmt w:val="bullet"/>
-      <w:lvlText w:val=""/>
-      <w:lvlJc w:val="left"/>
-      <w:pPr>
-        <w:ind w:left="2160" w:hanging="360"/>
-      </w:pPr>
-      <w:rPr>
-        <w:rFonts w:ascii="Wingdings" w:hAnsi="Wingdings" w:hint="default"/>
-      </w:rPr>
-    </w:lvl>
-    <w:lvl w:ilvl="3" w:tplc="04090001" w:tentative="1">
-      <w:start w:val="1"/>
-      <w:numFmt w:val="bullet"/>
-      <w:lvlText w:val=""/>
+    </w:lvl>
+    <w:lvl w:ilvl="2" w:tplc="0409001B" w:tentative="1">
+      <w:start w:val="1"/>
+      <w:numFmt w:val="lowerRoman"/>
+      <w:lvlText w:val="%3."/>
+      <w:lvlJc w:val="right"/>
+      <w:pPr>
+        <w:ind w:left="2160" w:hanging="180"/>
+      </w:pPr>
+    </w:lvl>
+    <w:lvl w:ilvl="3" w:tplc="0409000F" w:tentative="1">
+      <w:start w:val="1"/>
+      <w:numFmt w:val="decimal"/>
+      <w:lvlText w:val="%4."/>
       <w:lvlJc w:val="left"/>
       <w:pPr>
         <w:ind w:left="2880" w:hanging="360"/>
       </w:pPr>
-      <w:rPr>
-        <w:rFonts w:ascii="Symbol" w:hAnsi="Symbol" w:hint="default"/>
-      </w:rPr>
-    </w:lvl>
-    <w:lvl w:ilvl="4" w:tplc="04090003" w:tentative="1">
-      <w:start w:val="1"/>
-      <w:numFmt w:val="bullet"/>
-      <w:lvlText w:val="o"/>
+    </w:lvl>
+    <w:lvl w:ilvl="4" w:tplc="04090019" w:tentative="1">
+      <w:start w:val="1"/>
+      <w:numFmt w:val="lowerLetter"/>
+      <w:lvlText w:val="%5."/>
       <w:lvlJc w:val="left"/>
       <w:pPr>
         <w:ind w:left="3600" w:hanging="360"/>
       </w:pPr>
-      <w:rPr>
-        <w:rFonts w:ascii="Courier New" w:hAnsi="Courier New" w:cs="Courier New" w:hint="default"/>
-      </w:rPr>
-    </w:lvl>
-    <w:lvl w:ilvl="5" w:tplc="04090005" w:tentative="1">
-      <w:start w:val="1"/>
-      <w:numFmt w:val="bullet"/>
-      <w:lvlText w:val=""/>
-      <w:lvlJc w:val="left"/>
-      <w:pPr>
-        <w:ind w:left="4320" w:hanging="360"/>
-      </w:pPr>
-      <w:rPr>
-        <w:rFonts w:ascii="Wingdings" w:hAnsi="Wingdings" w:hint="default"/>
-      </w:rPr>
-    </w:lvl>
-    <w:lvl w:ilvl="6" w:tplc="04090001" w:tentative="1">
-      <w:start w:val="1"/>
-      <w:numFmt w:val="bullet"/>
-      <w:lvlText w:val=""/>
+    </w:lvl>
+    <w:lvl w:ilvl="5" w:tplc="0409001B" w:tentative="1">
+      <w:start w:val="1"/>
+      <w:numFmt w:val="lowerRoman"/>
+      <w:lvlText w:val="%6."/>
+      <w:lvlJc w:val="right"/>
+      <w:pPr>
+        <w:ind w:left="4320" w:hanging="180"/>
+      </w:pPr>
+    </w:lvl>
+    <w:lvl w:ilvl="6" w:tplc="0409000F" w:tentative="1">
+      <w:start w:val="1"/>
+      <w:numFmt w:val="decimal"/>
+      <w:lvlText w:val="%7."/>
       <w:lvlJc w:val="left"/>
       <w:pPr>
         <w:ind w:left="5040" w:hanging="360"/>
       </w:pPr>
-      <w:rPr>
-        <w:rFonts w:ascii="Symbol" w:hAnsi="Symbol" w:hint="default"/>
-      </w:rPr>
-    </w:lvl>
-    <w:lvl w:ilvl="7" w:tplc="04090003" w:tentative="1">
-      <w:start w:val="1"/>
-      <w:numFmt w:val="bullet"/>
-      <w:lvlText w:val="o"/>
+    </w:lvl>
+    <w:lvl w:ilvl="7" w:tplc="04090019" w:tentative="1">
+      <w:start w:val="1"/>
+      <w:numFmt w:val="lowerLetter"/>
+      <w:lvlText w:val="%8."/>
       <w:lvlJc w:val="left"/>
       <w:pPr>
         <w:ind w:left="5760" w:hanging="360"/>
       </w:pPr>
-      <w:rPr>
-        <w:rFonts w:ascii="Courier New" w:hAnsi="Courier New" w:cs="Courier New" w:hint="default"/>
-      </w:rPr>
-    </w:lvl>
-    <w:lvl w:ilvl="8" w:tplc="04090005" w:tentative="1">
-      <w:start w:val="1"/>
-      <w:numFmt w:val="bullet"/>
-      <w:lvlText w:val=""/>
-      <w:lvlJc w:val="left"/>
-      <w:pPr>
-        <w:ind w:left="6480" w:hanging="360"/>
-      </w:pPr>
-      <w:rPr>
-        <w:rFonts w:ascii="Wingdings" w:hAnsi="Wingdings" w:hint="default"/>
-      </w:rPr>
+    </w:lvl>
+    <w:lvl w:ilvl="8" w:tplc="0409001B" w:tentative="1">
+      <w:start w:val="1"/>
+      <w:numFmt w:val="lowerRoman"/>
+      <w:lvlText w:val="%9."/>
+      <w:lvlJc w:val="right"/>
+      <w:pPr>
+        <w:ind w:left="6480" w:hanging="180"/>
+      </w:pPr>
     </w:lvl>
   </w:abstractNum>
-  <w:abstractNum w:abstractNumId="3" w15:restartNumberingAfterBreak="0">
-    <w:nsid w:val="5722067A"/>
-    <w:multiLevelType w:val="hybridMultilevel"/>
-    <w:tmpl w:val="5E207D34"/>
-    <w:lvl w:ilvl="0" w:tplc="04090001">
-      <w:start w:val="1"/>
-      <w:numFmt w:val="bullet"/>
-      <w:lvlText w:val=""/>
-      <w:lvlJc w:val="left"/>
-      <w:pPr>
-        <w:ind w:left="720" w:hanging="360"/>
-      </w:pPr>
-      <w:rPr>
-        <w:rFonts w:ascii="Symbol" w:hAnsi="Symbol" w:hint="default"/>
-      </w:rPr>
-    </w:lvl>
-    <w:lvl w:ilvl="1" w:tplc="04090003" w:tentative="1">
-      <w:start w:val="1"/>
-      <w:numFmt w:val="bullet"/>
-      <w:lvlText w:val="o"/>
-      <w:lvlJc w:val="left"/>
-      <w:pPr>
-        <w:ind w:left="1440" w:hanging="360"/>
-      </w:pPr>
-      <w:rPr>
-        <w:rFonts w:ascii="Courier New" w:hAnsi="Courier New" w:cs="Courier New" w:hint="default"/>
-      </w:rPr>
-    </w:lvl>
-    <w:lvl w:ilvl="2" w:tplc="04090005" w:tentative="1">
-      <w:start w:val="1"/>
-      <w:numFmt w:val="bullet"/>
-      <w:lvlText w:val=""/>
-      <w:lvlJc w:val="left"/>
-      <w:pPr>
-        <w:ind w:left="2160" w:hanging="360"/>
-      </w:pPr>
-      <w:rPr>
-        <w:rFonts w:ascii="Wingdings" w:hAnsi="Wingdings" w:hint="default"/>
-      </w:rPr>
-    </w:lvl>
-    <w:lvl w:ilvl="3" w:tplc="04090001" w:tentative="1">
-      <w:start w:val="1"/>
-      <w:numFmt w:val="bullet"/>
-      <w:lvlText w:val=""/>
-      <w:lvlJc w:val="left"/>
-      <w:pPr>
-        <w:ind w:left="2880" w:hanging="360"/>
-      </w:pPr>
-      <w:rPr>
-        <w:rFonts w:ascii="Symbol" w:hAnsi="Symbol" w:hint="default"/>
-      </w:rPr>
-    </w:lvl>
-    <w:lvl w:ilvl="4" w:tplc="04090003" w:tentative="1">
-      <w:start w:val="1"/>
-      <w:numFmt w:val="bullet"/>
-      <w:lvlText w:val="o"/>
-      <w:lvlJc w:val="left"/>
-      <w:pPr>
-        <w:ind w:left="3600" w:hanging="360"/>
-      </w:pPr>
-      <w:rPr>
-        <w:rFonts w:ascii="Courier New" w:hAnsi="Courier New" w:cs="Courier New" w:hint="default"/>
-      </w:rPr>
-    </w:lvl>
-    <w:lvl w:ilvl="5" w:tplc="04090005" w:tentative="1">
-      <w:start w:val="1"/>
-      <w:numFmt w:val="bullet"/>
-      <w:lvlText w:val=""/>
-      <w:lvlJc w:val="left"/>
-      <w:pPr>
-        <w:ind w:left="4320" w:hanging="360"/>
-      </w:pPr>
-      <w:rPr>
-        <w:rFonts w:ascii="Wingdings" w:hAnsi="Wingdings" w:hint="default"/>
-      </w:rPr>
-    </w:lvl>
-    <w:lvl w:ilvl="6" w:tplc="04090001" w:tentative="1">
-      <w:start w:val="1"/>
-      <w:numFmt w:val="bullet"/>
-      <w:lvlText w:val=""/>
-      <w:lvlJc w:val="left"/>
-      <w:pPr>
-        <w:ind w:left="5040" w:hanging="360"/>
-      </w:pPr>
-      <w:rPr>
-        <w:rFonts w:ascii="Symbol" w:hAnsi="Symbol" w:hint="default"/>
-      </w:rPr>
-    </w:lvl>
-    <w:lvl w:ilvl="7" w:tplc="04090003" w:tentative="1">
-      <w:start w:val="1"/>
-      <w:numFmt w:val="bullet"/>
-      <w:lvlText w:val="o"/>
-      <w:lvlJc w:val="left"/>
-      <w:pPr>
-        <w:ind w:left="5760" w:hanging="360"/>
-      </w:pPr>
-      <w:rPr>
-        <w:rFonts w:ascii="Courier New" w:hAnsi="Courier New" w:cs="Courier New" w:hint="default"/>
-      </w:rPr>
-    </w:lvl>
-    <w:lvl w:ilvl="8" w:tplc="04090005" w:tentative="1">
-      <w:start w:val="1"/>
-      <w:numFmt w:val="bullet"/>
-      <w:lvlText w:val=""/>
-      <w:lvlJc w:val="left"/>
-      <w:pPr>
-        <w:ind w:left="6480" w:hanging="360"/>
-      </w:pPr>
-      <w:rPr>
-        <w:rFonts w:ascii="Wingdings" w:hAnsi="Wingdings" w:hint="default"/>
-      </w:rPr>
-    </w:lvl>
-  </w:abstractNum>
-  <w:num w:numId="1" w16cid:durableId="1522428049">
+  <w:num w:numId="1" w16cid:durableId="1751661267">
     <w:abstractNumId w:val="2"/>
   </w:num>
-  <w:num w:numId="2" w16cid:durableId="1580217259">
-    <w:abstractNumId w:val="3"/>
+  <w:num w:numId="2" w16cid:durableId="1084763290">
+    <w:abstractNumId w:val="1"/>
   </w:num>
-  <w:num w:numId="3" w16cid:durableId="475340061">
+  <w:num w:numId="3" w16cid:durableId="327486138">
     <w:abstractNumId w:val="0"/>
-  </w:num>
-  <w:num w:numId="4" w16cid:durableId="1418600141">
-    <w:abstractNumId w:val="1"/>
   </w:num>
 </w:numbering>
 </file>
@@ -1130,7 +932,7 @@
     <w:link w:val="Heading1Char"/>
     <w:uiPriority w:val="9"/>
     <w:qFormat/>
-    <w:rsid w:val="008970A8"/>
+    <w:rsid w:val="00CB0D8E"/>
     <w:pPr>
       <w:keepNext/>
       <w:keepLines/>
@@ -1153,7 +955,7 @@
     <w:semiHidden/>
     <w:unhideWhenUsed/>
     <w:qFormat/>
-    <w:rsid w:val="008970A8"/>
+    <w:rsid w:val="00CB0D8E"/>
     <w:pPr>
       <w:keepNext/>
       <w:keepLines/>
@@ -1176,7 +978,7 @@
     <w:semiHidden/>
     <w:unhideWhenUsed/>
     <w:qFormat/>
-    <w:rsid w:val="008970A8"/>
+    <w:rsid w:val="00CB0D8E"/>
     <w:pPr>
       <w:keepNext/>
       <w:keepLines/>
@@ -1199,7 +1001,7 @@
     <w:semiHidden/>
     <w:unhideWhenUsed/>
     <w:qFormat/>
-    <w:rsid w:val="008970A8"/>
+    <w:rsid w:val="00CB0D8E"/>
     <w:pPr>
       <w:keepNext/>
       <w:keepLines/>
@@ -1222,7 +1024,7 @@
     <w:semiHidden/>
     <w:unhideWhenUsed/>
     <w:qFormat/>
-    <w:rsid w:val="008970A8"/>
+    <w:rsid w:val="00CB0D8E"/>
     <w:pPr>
       <w:keepNext/>
       <w:keepLines/>
@@ -1243,7 +1045,7 @@
     <w:semiHidden/>
     <w:unhideWhenUsed/>
     <w:qFormat/>
-    <w:rsid w:val="008970A8"/>
+    <w:rsid w:val="00CB0D8E"/>
     <w:pPr>
       <w:keepNext/>
       <w:keepLines/>
@@ -1266,7 +1068,7 @@
     <w:semiHidden/>
     <w:unhideWhenUsed/>
     <w:qFormat/>
-    <w:rsid w:val="008970A8"/>
+    <w:rsid w:val="00CB0D8E"/>
     <w:pPr>
       <w:keepNext/>
       <w:keepLines/>
@@ -1287,7 +1089,7 @@
     <w:semiHidden/>
     <w:unhideWhenUsed/>
     <w:qFormat/>
-    <w:rsid w:val="008970A8"/>
+    <w:rsid w:val="00CB0D8E"/>
     <w:pPr>
       <w:keepNext/>
       <w:keepLines/>
@@ -1310,7 +1112,7 @@
     <w:semiHidden/>
     <w:unhideWhenUsed/>
     <w:qFormat/>
-    <w:rsid w:val="008970A8"/>
+    <w:rsid w:val="00CB0D8E"/>
     <w:pPr>
       <w:keepNext/>
       <w:keepLines/>
@@ -1354,7 +1156,7 @@
     <w:basedOn w:val="DefaultParagraphFont"/>
     <w:link w:val="Heading1"/>
     <w:uiPriority w:val="9"/>
-    <w:rsid w:val="008970A8"/>
+    <w:rsid w:val="00CB0D8E"/>
     <w:rPr>
       <w:rFonts w:asciiTheme="majorHAnsi" w:eastAsiaTheme="majorEastAsia" w:hAnsiTheme="majorHAnsi" w:cstheme="majorBidi"/>
       <w:color w:val="2F5496" w:themeColor="accent1" w:themeShade="BF"/>
@@ -1368,7 +1170,7 @@
     <w:link w:val="Heading2"/>
     <w:uiPriority w:val="9"/>
     <w:semiHidden/>
-    <w:rsid w:val="008970A8"/>
+    <w:rsid w:val="00CB0D8E"/>
     <w:rPr>
       <w:rFonts w:asciiTheme="majorHAnsi" w:eastAsiaTheme="majorEastAsia" w:hAnsiTheme="majorHAnsi" w:cstheme="majorBidi"/>
       <w:color w:val="2F5496" w:themeColor="accent1" w:themeShade="BF"/>
@@ -1382,7 +1184,7 @@
     <w:link w:val="Heading3"/>
     <w:uiPriority w:val="9"/>
     <w:semiHidden/>
-    <w:rsid w:val="008970A8"/>
+    <w:rsid w:val="00CB0D8E"/>
     <w:rPr>
       <w:rFonts w:eastAsiaTheme="majorEastAsia" w:cstheme="majorBidi"/>
       <w:color w:val="2F5496" w:themeColor="accent1" w:themeShade="BF"/>
@@ -1396,7 +1198,7 @@
     <w:link w:val="Heading4"/>
     <w:uiPriority w:val="9"/>
     <w:semiHidden/>
-    <w:rsid w:val="008970A8"/>
+    <w:rsid w:val="00CB0D8E"/>
     <w:rPr>
       <w:rFonts w:eastAsiaTheme="majorEastAsia" w:cstheme="majorBidi"/>
       <w:i/>
@@ -1410,7 +1212,7 @@
     <w:link w:val="Heading5"/>
     <w:uiPriority w:val="9"/>
     <w:semiHidden/>
-    <w:rsid w:val="008970A8"/>
+    <w:rsid w:val="00CB0D8E"/>
     <w:rPr>
       <w:rFonts w:eastAsiaTheme="majorEastAsia" w:cstheme="majorBidi"/>
       <w:color w:val="2F5496" w:themeColor="accent1" w:themeShade="BF"/>
@@ -1422,7 +1224,7 @@
     <w:link w:val="Heading6"/>
     <w:uiPriority w:val="9"/>
     <w:semiHidden/>
-    <w:rsid w:val="008970A8"/>
+    <w:rsid w:val="00CB0D8E"/>
     <w:rPr>
       <w:rFonts w:eastAsiaTheme="majorEastAsia" w:cstheme="majorBidi"/>
       <w:i/>
@@ -1436,7 +1238,7 @@
     <w:link w:val="Heading7"/>
     <w:uiPriority w:val="9"/>
     <w:semiHidden/>
-    <w:rsid w:val="008970A8"/>
+    <w:rsid w:val="00CB0D8E"/>
     <w:rPr>
       <w:rFonts w:eastAsiaTheme="majorEastAsia" w:cstheme="majorBidi"/>
       <w:color w:val="595959" w:themeColor="text1" w:themeTint="A6"/>
@@ -1448,7 +1250,7 @@
     <w:link w:val="Heading8"/>
     <w:uiPriority w:val="9"/>
     <w:semiHidden/>
-    <w:rsid w:val="008970A8"/>
+    <w:rsid w:val="00CB0D8E"/>
     <w:rPr>
       <w:rFonts w:eastAsiaTheme="majorEastAsia" w:cstheme="majorBidi"/>
       <w:i/>
@@ -1462,7 +1264,7 @@
     <w:link w:val="Heading9"/>
     <w:uiPriority w:val="9"/>
     <w:semiHidden/>
-    <w:rsid w:val="008970A8"/>
+    <w:rsid w:val="00CB0D8E"/>
     <w:rPr>
       <w:rFonts w:eastAsiaTheme="majorEastAsia" w:cstheme="majorBidi"/>
       <w:color w:val="272727" w:themeColor="text1" w:themeTint="D8"/>
@@ -1475,7 +1277,7 @@
     <w:link w:val="TitleChar"/>
     <w:uiPriority w:val="10"/>
     <w:qFormat/>
-    <w:rsid w:val="008970A8"/>
+    <w:rsid w:val="00CB0D8E"/>
     <w:pPr>
       <w:spacing w:after="80" w:line="240" w:lineRule="auto"/>
       <w:contextualSpacing/>
@@ -1493,7 +1295,7 @@
     <w:basedOn w:val="DefaultParagraphFont"/>
     <w:link w:val="Title"/>
     <w:uiPriority w:val="10"/>
-    <w:rsid w:val="008970A8"/>
+    <w:rsid w:val="00CB0D8E"/>
     <w:rPr>
       <w:rFonts w:asciiTheme="majorHAnsi" w:eastAsiaTheme="majorEastAsia" w:hAnsiTheme="majorHAnsi" w:cstheme="majorBidi"/>
       <w:spacing w:val="-10"/>
@@ -1509,7 +1311,7 @@
     <w:link w:val="SubtitleChar"/>
     <w:uiPriority w:val="11"/>
     <w:qFormat/>
-    <w:rsid w:val="008970A8"/>
+    <w:rsid w:val="00CB0D8E"/>
     <w:pPr>
       <w:numPr>
         <w:ilvl w:val="1"/>
@@ -1528,7 +1330,7 @@
     <w:basedOn w:val="DefaultParagraphFont"/>
     <w:link w:val="Subtitle"/>
     <w:uiPriority w:val="11"/>
-    <w:rsid w:val="008970A8"/>
+    <w:rsid w:val="00CB0D8E"/>
     <w:rPr>
       <w:rFonts w:eastAsiaTheme="majorEastAsia" w:cstheme="majorBidi"/>
       <w:color w:val="595959" w:themeColor="text1" w:themeTint="A6"/>
@@ -1544,7 +1346,7 @@
     <w:link w:val="QuoteChar"/>
     <w:uiPriority w:val="29"/>
     <w:qFormat/>
-    <w:rsid w:val="008970A8"/>
+    <w:rsid w:val="00CB0D8E"/>
     <w:pPr>
       <w:spacing w:before="160"/>
       <w:jc w:val="center"/>
@@ -1560,7 +1362,7 @@
     <w:basedOn w:val="DefaultParagraphFont"/>
     <w:link w:val="Quote"/>
     <w:uiPriority w:val="29"/>
-    <w:rsid w:val="008970A8"/>
+    <w:rsid w:val="00CB0D8E"/>
     <w:rPr>
       <w:i/>
       <w:iCs/>
@@ -1572,7 +1374,7 @@
     <w:basedOn w:val="Normal"/>
     <w:uiPriority w:val="34"/>
     <w:qFormat/>
-    <w:rsid w:val="008970A8"/>
+    <w:rsid w:val="00CB0D8E"/>
     <w:pPr>
       <w:ind w:left="720"/>
       <w:contextualSpacing/>
@@ -1583,7 +1385,7 @@
     <w:basedOn w:val="DefaultParagraphFont"/>
     <w:uiPriority w:val="21"/>
     <w:qFormat/>
-    <w:rsid w:val="008970A8"/>
+    <w:rsid w:val="00CB0D8E"/>
     <w:rPr>
       <w:i/>
       <w:iCs/>
@@ -1597,7 +1399,7 @@
     <w:link w:val="IntenseQuoteChar"/>
     <w:uiPriority w:val="30"/>
     <w:qFormat/>
-    <w:rsid w:val="008970A8"/>
+    <w:rsid w:val="00CB0D8E"/>
     <w:pPr>
       <w:pBdr>
         <w:top w:val="single" w:sz="4" w:space="10" w:color="2F5496" w:themeColor="accent1" w:themeShade="BF"/>
@@ -1618,7 +1420,7 @@
     <w:basedOn w:val="DefaultParagraphFont"/>
     <w:link w:val="IntenseQuote"/>
     <w:uiPriority w:val="30"/>
-    <w:rsid w:val="008970A8"/>
+    <w:rsid w:val="00CB0D8E"/>
     <w:rPr>
       <w:i/>
       <w:iCs/>
@@ -1630,7 +1432,7 @@
     <w:basedOn w:val="DefaultParagraphFont"/>
     <w:uiPriority w:val="32"/>
     <w:qFormat/>
-    <w:rsid w:val="008970A8"/>
+    <w:rsid w:val="00CB0D8E"/>
     <w:rPr>
       <w:b/>
       <w:bCs/>

</xml_diff>